<commit_message>
Complete published DM-GAN successor evaluation
</commit_message>
<xml_diff>
--- a/outputs/Contribution Form-G_.docx
+++ b/outputs/Contribution Form-G_.docx
@@ -160,18 +160,24 @@
         <w:tc>
           <w:tcPr>
             <w:tcW w:w="4127" w:type="dxa"/>
-            <w:vAlign w:val="top"/>
-          </w:tcPr>
-          <w:p>
-            <w:pPr>
-              <w:jc w:val="left"/>
-              <w:rPr>
-                <w:rFonts w:hint="default" w:ascii="Times New Roman Regular" w:hAnsi="Times New Roman Regular" w:cs="Times New Roman Regular"/>
-              </w:rPr>
-            </w:pPr>
-            <w:r>
-              <w:rPr>
-                <w:rFonts w:hint="default" w:ascii="Times New Roman Regular" w:hAnsi="Times New Roman Regular" w:cs="Times New Roman Regular"/>
+            <w:vAlign w:val="center"/>
+            <w:tcMar>
+              <w:top w:w="70" w:type="dxa"/>
+              <w:start w:w="75" w:type="dxa"/>
+              <w:bottom w:w="70" w:type="dxa"/>
+              <w:end w:w="75" w:type="dxa"/>
+            </w:tcMar>
+          </w:tcPr>
+          <w:p>
+            <w:pPr>
+              <w:spacing w:after="0" w:line="240" w:lineRule="auto"/>
+            </w:pPr>
+            <w:r/>
+            <w:r>
+              <w:rPr>
+                <w:rFonts w:ascii="Times New Roman" w:hAnsi="Times New Roman" w:eastAsia="Times New Roman"/>
+                <w:b/>
+                <w:sz w:val="18"/>
               </w:rPr>
               <w:t>HSDS-501001</w:t>
             </w:r>
@@ -226,23 +232,22 @@
             <w:tcW w:w="4127" w:type="dxa"/>
             <w:vAlign w:val="center"/>
             <w:tcMar>
-              <w:top w:w="90" w:type="dxa"/>
-              <w:start w:w="100" w:type="dxa"/>
-              <w:bottom w:w="90" w:type="dxa"/>
-              <w:end w:w="100" w:type="dxa"/>
+              <w:top w:w="70" w:type="dxa"/>
+              <w:start w:w="75" w:type="dxa"/>
+              <w:bottom w:w="70" w:type="dxa"/>
+              <w:end w:w="75" w:type="dxa"/>
             </w:tcMar>
           </w:tcPr>
           <w:p>
             <w:pPr>
-              <w:spacing w:line="240" w:lineRule="auto" w:before="0" w:after="40"/>
-              <w:jc w:val="left"/>
+              <w:spacing w:after="0" w:line="240" w:lineRule="auto"/>
             </w:pPr>
             <w:r/>
             <w:r>
               <w:rPr>
                 <w:rFonts w:ascii="Times New Roman" w:hAnsi="Times New Roman" w:eastAsia="Times New Roman"/>
-                <w:color w:val="B42318"/>
-                <w:sz w:val="21"/>
+                <w:b/>
+                <w:sz w:val="18"/>
               </w:rPr>
               <w:t>Group [CONFIRM NUMBER]</w:t>
             </w:r>
@@ -290,25 +295,24 @@
             <w:tcW w:w="4127" w:type="dxa"/>
             <w:vAlign w:val="center"/>
             <w:tcMar>
-              <w:top w:w="90" w:type="dxa"/>
-              <w:start w:w="100" w:type="dxa"/>
-              <w:bottom w:w="90" w:type="dxa"/>
-              <w:end w:w="100" w:type="dxa"/>
+              <w:top w:w="70" w:type="dxa"/>
+              <w:start w:w="75" w:type="dxa"/>
+              <w:bottom w:w="70" w:type="dxa"/>
+              <w:end w:w="75" w:type="dxa"/>
             </w:tcMar>
           </w:tcPr>
           <w:p>
             <w:pPr>
-              <w:spacing w:line="240" w:lineRule="auto" w:before="0" w:after="40"/>
-              <w:jc w:val="left"/>
+              <w:spacing w:after="0" w:line="240" w:lineRule="auto"/>
             </w:pPr>
             <w:r/>
             <w:r>
               <w:rPr>
                 <w:rFonts w:ascii="Times New Roman" w:hAnsi="Times New Roman" w:eastAsia="Times New Roman"/>
-                <w:color w:val="000000"/>
-                <w:sz w:val="20"/>
-              </w:rPr>
-              <w:t>DM-GAN Reimplementation and Part-Aware Memory Alignment for Text-to-Image Synthesis on CUB-200-2011</w:t>
+                <w:b/>
+                <w:sz w:val="18"/>
+              </w:rPr>
+              <w:t>DM-GAN Reimplementation and Modality-Disentangled Successor Evaluation on CUB-200-2011</w:t>
             </w:r>
           </w:p>
         </w:tc>
@@ -361,23 +365,22 @@
             <w:tcW w:w="4127" w:type="dxa"/>
             <w:vAlign w:val="center"/>
             <w:tcMar>
-              <w:top w:w="90" w:type="dxa"/>
-              <w:start w:w="100" w:type="dxa"/>
-              <w:bottom w:w="90" w:type="dxa"/>
-              <w:end w:w="100" w:type="dxa"/>
+              <w:top w:w="70" w:type="dxa"/>
+              <w:start w:w="75" w:type="dxa"/>
+              <w:bottom w:w="70" w:type="dxa"/>
+              <w:end w:w="75" w:type="dxa"/>
             </w:tcMar>
           </w:tcPr>
           <w:p>
             <w:pPr>
-              <w:spacing w:line="240" w:lineRule="auto" w:before="0" w:after="40"/>
-              <w:jc w:val="left"/>
+              <w:spacing w:after="0" w:line="240" w:lineRule="auto"/>
             </w:pPr>
             <w:r/>
             <w:r>
               <w:rPr>
                 <w:rFonts w:ascii="Times New Roman" w:hAnsi="Times New Roman" w:eastAsia="Times New Roman"/>
-                <w:color w:val="B42318"/>
-                <w:sz w:val="21"/>
+                <w:b/>
+                <w:sz w:val="18"/>
               </w:rPr>
               <w:t>[CONFIRM GROUP LEADER FULL NAME]</w:t>
             </w:r>
@@ -894,23 +897,22 @@
             <w:gridSpan w:val="2"/>
             <w:vAlign w:val="center"/>
             <w:tcMar>
-              <w:top w:w="90" w:type="dxa"/>
-              <w:start w:w="100" w:type="dxa"/>
-              <w:bottom w:w="90" w:type="dxa"/>
-              <w:end w:w="100" w:type="dxa"/>
+              <w:top w:w="70" w:type="dxa"/>
+              <w:start w:w="75" w:type="dxa"/>
+              <w:bottom w:w="70" w:type="dxa"/>
+              <w:end w:w="75" w:type="dxa"/>
             </w:tcMar>
           </w:tcPr>
           <w:p>
             <w:pPr>
-              <w:spacing w:line="240" w:lineRule="auto" w:before="0" w:after="40"/>
-              <w:jc w:val="left"/>
+              <w:spacing w:after="0" w:line="240" w:lineRule="auto"/>
             </w:pPr>
             <w:r/>
             <w:r>
               <w:rPr>
                 <w:rFonts w:ascii="Times New Roman" w:hAnsi="Times New Roman" w:eastAsia="Times New Roman"/>
-                <w:color w:val="000000"/>
-                <w:sz w:val="22"/>
+                <w:b/>
+                <w:sz w:val="18"/>
               </w:rPr>
               <w:t>Wenzhe Cao</w:t>
             </w:r>
@@ -975,25 +977,24 @@
             <w:tcW w:w="3765" w:type="dxa"/>
             <w:vAlign w:val="center"/>
             <w:tcMar>
-              <w:top w:w="90" w:type="dxa"/>
-              <w:start w:w="100" w:type="dxa"/>
-              <w:bottom w:w="90" w:type="dxa"/>
-              <w:end w:w="100" w:type="dxa"/>
+              <w:top w:w="70" w:type="dxa"/>
+              <w:start w:w="75" w:type="dxa"/>
+              <w:bottom w:w="70" w:type="dxa"/>
+              <w:end w:w="75" w:type="dxa"/>
             </w:tcMar>
           </w:tcPr>
           <w:p>
             <w:pPr>
-              <w:spacing w:line="240" w:lineRule="auto" w:before="0" w:after="40"/>
-              <w:jc w:val="left"/>
+              <w:spacing w:after="0" w:line="240" w:lineRule="auto"/>
             </w:pPr>
             <w:r/>
             <w:r>
               <w:rPr>
                 <w:rFonts w:ascii="Times New Roman" w:hAnsi="Times New Roman" w:eastAsia="Times New Roman"/>
-                <w:color w:val="B42318"/>
-                <w:sz w:val="19"/>
-              </w:rPr>
-              <w:t>[DRAFT A — confirm] CUB dataset, split, bounding-box preprocessing, and synchronized landmark transformations.</w:t>
+                <w:b w:val="0"/>
+                <w:sz w:val="18"/>
+              </w:rPr>
+              <w:t>[DRAFT — confirm] CUB data pipeline, official split, bounding-box preprocessing, and baseline input validation.</w:t>
             </w:r>
           </w:p>
         </w:tc>
@@ -1057,25 +1058,24 @@
             <w:tcW w:w="3765" w:type="dxa"/>
             <w:vAlign w:val="center"/>
             <w:tcMar>
-              <w:top w:w="90" w:type="dxa"/>
-              <w:start w:w="100" w:type="dxa"/>
-              <w:bottom w:w="90" w:type="dxa"/>
-              <w:end w:w="100" w:type="dxa"/>
+              <w:top w:w="70" w:type="dxa"/>
+              <w:start w:w="75" w:type="dxa"/>
+              <w:bottom w:w="70" w:type="dxa"/>
+              <w:end w:w="75" w:type="dxa"/>
             </w:tcMar>
           </w:tcPr>
           <w:p>
             <w:pPr>
-              <w:spacing w:line="240" w:lineRule="auto" w:before="0" w:after="40"/>
-              <w:jc w:val="left"/>
+              <w:spacing w:after="0" w:line="240" w:lineRule="auto"/>
             </w:pPr>
             <w:r/>
             <w:r>
               <w:rPr>
                 <w:rFonts w:ascii="Times New Roman" w:hAnsi="Times New Roman" w:eastAsia="Times New Roman"/>
-                <w:color w:val="B42318"/>
-                <w:sz w:val="19"/>
-              </w:rPr>
-              <w:t>[DRAFT A — confirm] Dataset/preprocessing and coordinate-synchronization sections; data reproducibility review.</w:t>
+                <w:b w:val="0"/>
+                <w:sz w:val="18"/>
+              </w:rPr>
+              <w:t>[DRAFT — confirm] Introduction; CUB data/preprocessing; dataset provenance and reproducibility review.</w:t>
             </w:r>
           </w:p>
         </w:tc>
@@ -1139,25 +1139,24 @@
             <w:tcW w:w="3765" w:type="dxa"/>
             <w:vAlign w:val="center"/>
             <w:tcMar>
-              <w:top w:w="90" w:type="dxa"/>
-              <w:start w:w="100" w:type="dxa"/>
-              <w:bottom w:w="90" w:type="dxa"/>
-              <w:end w:w="100" w:type="dxa"/>
+              <w:top w:w="70" w:type="dxa"/>
+              <w:start w:w="75" w:type="dxa"/>
+              <w:bottom w:w="70" w:type="dxa"/>
+              <w:end w:w="75" w:type="dxa"/>
             </w:tcMar>
           </w:tcPr>
           <w:p>
             <w:pPr>
-              <w:spacing w:line="240" w:lineRule="auto" w:before="0" w:after="40"/>
-              <w:jc w:val="left"/>
+              <w:spacing w:after="0" w:line="240" w:lineRule="auto"/>
             </w:pPr>
             <w:r/>
             <w:r>
               <w:rPr>
                 <w:rFonts w:ascii="Times New Roman" w:hAnsi="Times New Roman" w:eastAsia="Times New Roman"/>
-                <w:color w:val="B42318"/>
-                <w:sz w:val="19"/>
-              </w:rPr>
-              <w:t>Contribution share: [CONFIRM __%]. Proposed role: Dataset and Preprocessing. Prepared and verified CUB image-caption inputs, metadata, augmentation, and landmark coordinates; contributed the related oral and written material.</w:t>
+                <w:b w:val="0"/>
+                <w:sz w:val="17"/>
+              </w:rPr>
+              <w:t>Contribution share: [CONFIRM __%]. Proposed role: Dataset and Preprocessing. Verified the CUB image-caption inputs, official metadata, split, bounding boxes, and reproducible data path used by the baseline and successor evaluations.</w:t>
             </w:r>
           </w:p>
         </w:tc>
@@ -1250,23 +1249,22 @@
             <w:gridSpan w:val="2"/>
             <w:vAlign w:val="center"/>
             <w:tcMar>
-              <w:top w:w="90" w:type="dxa"/>
-              <w:start w:w="100" w:type="dxa"/>
-              <w:bottom w:w="90" w:type="dxa"/>
-              <w:end w:w="100" w:type="dxa"/>
+              <w:top w:w="70" w:type="dxa"/>
+              <w:start w:w="75" w:type="dxa"/>
+              <w:bottom w:w="70" w:type="dxa"/>
+              <w:end w:w="75" w:type="dxa"/>
             </w:tcMar>
           </w:tcPr>
           <w:p>
             <w:pPr>
-              <w:spacing w:line="240" w:lineRule="auto" w:before="0" w:after="40"/>
-              <w:jc w:val="left"/>
+              <w:spacing w:after="0" w:line="240" w:lineRule="auto"/>
             </w:pPr>
             <w:r/>
             <w:r>
               <w:rPr>
                 <w:rFonts w:ascii="Times New Roman" w:hAnsi="Times New Roman" w:eastAsia="Times New Roman"/>
-                <w:color w:val="000000"/>
-                <w:sz w:val="22"/>
+                <w:b/>
+                <w:sz w:val="18"/>
               </w:rPr>
               <w:t>Jikui Zhou</w:t>
             </w:r>
@@ -1331,25 +1329,24 @@
             <w:tcW w:w="3765" w:type="dxa"/>
             <w:vAlign w:val="center"/>
             <w:tcMar>
-              <w:top w:w="90" w:type="dxa"/>
-              <w:start w:w="100" w:type="dxa"/>
-              <w:bottom w:w="90" w:type="dxa"/>
-              <w:end w:w="100" w:type="dxa"/>
+              <w:top w:w="70" w:type="dxa"/>
+              <w:start w:w="75" w:type="dxa"/>
+              <w:bottom w:w="70" w:type="dxa"/>
+              <w:end w:w="75" w:type="dxa"/>
             </w:tcMar>
           </w:tcPr>
           <w:p>
             <w:pPr>
-              <w:spacing w:line="240" w:lineRule="auto" w:before="0" w:after="40"/>
-              <w:jc w:val="left"/>
+              <w:spacing w:after="0" w:line="240" w:lineRule="auto"/>
             </w:pPr>
             <w:r/>
             <w:r>
               <w:rPr>
                 <w:rFonts w:ascii="Times New Roman" w:hAnsi="Times New Roman" w:eastAsia="Times New Roman"/>
-                <w:color w:val="B42318"/>
-                <w:sz w:val="19"/>
-              </w:rPr>
-              <w:t>[DRAFT B — confirm] DAMSM text encoder, vocabulary/checkpoint compatibility, and word/sentence conditioning.</w:t>
+                <w:b w:val="0"/>
+                <w:sz w:val="18"/>
+              </w:rPr>
+              <w:t>[DRAFT — confirm] DAMSM text conditioning, vocabulary/checkpoint compatibility, literature screening, and semantic-evaluation protocol.</w:t>
             </w:r>
           </w:p>
         </w:tc>
@@ -1413,25 +1410,24 @@
             <w:tcW w:w="3765" w:type="dxa"/>
             <w:vAlign w:val="center"/>
             <w:tcMar>
-              <w:top w:w="90" w:type="dxa"/>
-              <w:start w:w="100" w:type="dxa"/>
-              <w:bottom w:w="90" w:type="dxa"/>
-              <w:end w:w="100" w:type="dxa"/>
+              <w:top w:w="70" w:type="dxa"/>
+              <w:start w:w="75" w:type="dxa"/>
+              <w:bottom w:w="70" w:type="dxa"/>
+              <w:end w:w="75" w:type="dxa"/>
             </w:tcMar>
           </w:tcPr>
           <w:p>
             <w:pPr>
-              <w:spacing w:line="240" w:lineRule="auto" w:before="0" w:after="40"/>
-              <w:jc w:val="left"/>
+              <w:spacing w:after="0" w:line="240" w:lineRule="auto"/>
             </w:pPr>
             <w:r/>
             <w:r>
               <w:rPr>
                 <w:rFonts w:ascii="Times New Roman" w:hAnsi="Times New Roman" w:eastAsia="Times New Roman"/>
-                <w:color w:val="B42318"/>
-                <w:sz w:val="19"/>
-              </w:rPr>
-              <w:t>[DRAFT B — confirm] DAMSM and text-representation sections; semantic-alignment review.</w:t>
+                <w:b w:val="0"/>
+                <w:sz w:val="18"/>
+              </w:rPr>
+              <w:t>[DRAFT — confirm] DAMSM/text representation, related work, evaluator independence, citations, and references.</w:t>
             </w:r>
           </w:p>
         </w:tc>
@@ -1495,25 +1491,24 @@
             <w:tcW w:w="3765" w:type="dxa"/>
             <w:vAlign w:val="center"/>
             <w:tcMar>
-              <w:top w:w="90" w:type="dxa"/>
-              <w:start w:w="100" w:type="dxa"/>
-              <w:bottom w:w="90" w:type="dxa"/>
-              <w:end w:w="100" w:type="dxa"/>
+              <w:top w:w="70" w:type="dxa"/>
+              <w:start w:w="75" w:type="dxa"/>
+              <w:bottom w:w="70" w:type="dxa"/>
+              <w:end w:w="75" w:type="dxa"/>
             </w:tcMar>
           </w:tcPr>
           <w:p>
             <w:pPr>
-              <w:spacing w:line="240" w:lineRule="auto" w:before="0" w:after="40"/>
-              <w:jc w:val="left"/>
+              <w:spacing w:after="0" w:line="240" w:lineRule="auto"/>
             </w:pPr>
             <w:r/>
             <w:r>
               <w:rPr>
                 <w:rFonts w:ascii="Times New Roman" w:hAnsi="Times New Roman" w:eastAsia="Times New Roman"/>
-                <w:color w:val="B42318"/>
-                <w:sz w:val="19"/>
-              </w:rPr>
-              <w:t>Contribution share: [CONFIRM __%]. Proposed role: Text Encoder / DAMSM. Loaded and validated pretrained DAMSM assets, checked vocabulary compatibility, and explained the word- and sentence-level features used for training and evaluation.</w:t>
+                <w:b w:val="0"/>
+                <w:sz w:val="17"/>
+              </w:rPr>
+              <w:t>Contribution share: [CONFIRM __%]. Proposed role: DAMSM and Literature Review. Validated pretrained text/image encoders and vocabulary compatibility, screened MDD/CL/DAE papers and released assets, and reviewed R-precision methodology.</w:t>
             </w:r>
           </w:p>
         </w:tc>
@@ -1606,23 +1601,22 @@
             <w:gridSpan w:val="2"/>
             <w:vAlign w:val="center"/>
             <w:tcMar>
-              <w:top w:w="90" w:type="dxa"/>
-              <w:start w:w="100" w:type="dxa"/>
-              <w:bottom w:w="90" w:type="dxa"/>
-              <w:end w:w="100" w:type="dxa"/>
+              <w:top w:w="70" w:type="dxa"/>
+              <w:start w:w="75" w:type="dxa"/>
+              <w:bottom w:w="70" w:type="dxa"/>
+              <w:end w:w="75" w:type="dxa"/>
             </w:tcMar>
           </w:tcPr>
           <w:p>
             <w:pPr>
-              <w:spacing w:line="240" w:lineRule="auto" w:before="0" w:after="40"/>
-              <w:jc w:val="left"/>
+              <w:spacing w:after="0" w:line="240" w:lineRule="auto"/>
             </w:pPr>
             <w:r/>
             <w:r>
               <w:rPr>
                 <w:rFonts w:ascii="Times New Roman" w:hAnsi="Times New Roman" w:eastAsia="Times New Roman"/>
-                <w:color w:val="000000"/>
-                <w:sz w:val="22"/>
+                <w:b/>
+                <w:sz w:val="18"/>
               </w:rPr>
               <w:t>Xinyi Jiang</w:t>
             </w:r>
@@ -1687,25 +1681,24 @@
             <w:tcW w:w="3765" w:type="dxa"/>
             <w:vAlign w:val="center"/>
             <w:tcMar>
-              <w:top w:w="90" w:type="dxa"/>
-              <w:start w:w="100" w:type="dxa"/>
-              <w:bottom w:w="90" w:type="dxa"/>
-              <w:end w:w="100" w:type="dxa"/>
+              <w:top w:w="70" w:type="dxa"/>
+              <w:start w:w="75" w:type="dxa"/>
+              <w:bottom w:w="70" w:type="dxa"/>
+              <w:end w:w="75" w:type="dxa"/>
             </w:tcMar>
           </w:tcPr>
           <w:p>
             <w:pPr>
-              <w:spacing w:line="240" w:lineRule="auto" w:before="0" w:after="40"/>
-              <w:jc w:val="left"/>
+              <w:spacing w:after="0" w:line="240" w:lineRule="auto"/>
             </w:pPr>
             <w:r/>
             <w:r>
               <w:rPr>
                 <w:rFonts w:ascii="Times New Roman" w:hAnsi="Times New Roman" w:eastAsia="Times New Roman"/>
-                <w:color w:val="B42318"/>
-                <w:sz w:val="19"/>
-              </w:rPr>
-              <w:t>[DRAFT C — confirm] DM-GAN generator/discriminators, dynamic memory, and the part-aware alignment method.</w:t>
+                <w:b w:val="0"/>
+                <w:sz w:val="18"/>
+              </w:rPr>
+              <w:t>[DRAFT — confirm] DM-GAN generator/dynamic memory, MDD discriminator concept, and successor checkpoint compatibility.</w:t>
             </w:r>
           </w:p>
         </w:tc>
@@ -1769,25 +1762,24 @@
             <w:tcW w:w="3765" w:type="dxa"/>
             <w:vAlign w:val="center"/>
             <w:tcMar>
-              <w:top w:w="90" w:type="dxa"/>
-              <w:start w:w="100" w:type="dxa"/>
-              <w:bottom w:w="90" w:type="dxa"/>
-              <w:end w:w="100" w:type="dxa"/>
+              <w:top w:w="70" w:type="dxa"/>
+              <w:start w:w="75" w:type="dxa"/>
+              <w:bottom w:w="70" w:type="dxa"/>
+              <w:end w:w="75" w:type="dxa"/>
             </w:tcMar>
           </w:tcPr>
           <w:p>
             <w:pPr>
-              <w:spacing w:line="240" w:lineRule="auto" w:before="0" w:after="40"/>
-              <w:jc w:val="left"/>
+              <w:spacing w:after="0" w:line="240" w:lineRule="auto"/>
             </w:pPr>
             <w:r/>
             <w:r>
               <w:rPr>
                 <w:rFonts w:ascii="Times New Roman" w:hAnsi="Times New Roman" w:eastAsia="Times New Roman"/>
-                <w:color w:val="B42318"/>
-                <w:sz w:val="19"/>
-              </w:rPr>
-              <w:t>[DRAFT C — confirm] Model-construction and proposed-method sections, including Gaussian part maps and alignment loss.</w:t>
+                <w:b w:val="0"/>
+                <w:sz w:val="18"/>
+              </w:rPr>
+              <w:t>[DRAFT — confirm] Baseline model construction, MDD method, and CL/DAE comparison sections.</w:t>
             </w:r>
           </w:p>
         </w:tc>
@@ -1851,25 +1843,24 @@
             <w:tcW w:w="3765" w:type="dxa"/>
             <w:vAlign w:val="center"/>
             <w:tcMar>
-              <w:top w:w="90" w:type="dxa"/>
-              <w:start w:w="100" w:type="dxa"/>
-              <w:bottom w:w="90" w:type="dxa"/>
-              <w:end w:w="100" w:type="dxa"/>
+              <w:top w:w="70" w:type="dxa"/>
+              <w:start w:w="75" w:type="dxa"/>
+              <w:bottom w:w="70" w:type="dxa"/>
+              <w:end w:w="75" w:type="dxa"/>
             </w:tcMar>
           </w:tcPr>
           <w:p>
             <w:pPr>
-              <w:spacing w:line="240" w:lineRule="auto" w:before="0" w:after="40"/>
-              <w:jc w:val="left"/>
+              <w:spacing w:after="0" w:line="240" w:lineRule="auto"/>
             </w:pPr>
             <w:r/>
             <w:r>
               <w:rPr>
                 <w:rFonts w:ascii="Times New Roman" w:hAnsi="Times New Roman" w:eastAsia="Times New Roman"/>
-                <w:color w:val="B42318"/>
-                <w:sz w:val="19"/>
-              </w:rPr>
-              <w:t>Contribution share: [CONFIRM __%]. Proposed role: DM-GAN Model and Part-Aware Method. Developed and reviewed the generator, discriminators, memory diagnostics, token-part targets, and optional part-aware objective.</w:t>
+                <w:b w:val="0"/>
+                <w:sz w:val="17"/>
+              </w:rPr>
+              <w:t>Contribution share: [CONFIRM __%]. Proposed role: Model and Successor Integration. Developed and reviewed the modern DM-GAN core, dynamic memory, conditioning policy, strict checkpoint loading, and model adapters for published successor checks.</w:t>
             </w:r>
           </w:p>
         </w:tc>
@@ -1962,23 +1953,22 @@
             <w:gridSpan w:val="2"/>
             <w:vAlign w:val="center"/>
             <w:tcMar>
-              <w:top w:w="90" w:type="dxa"/>
-              <w:start w:w="100" w:type="dxa"/>
-              <w:bottom w:w="90" w:type="dxa"/>
-              <w:end w:w="100" w:type="dxa"/>
+              <w:top w:w="70" w:type="dxa"/>
+              <w:start w:w="75" w:type="dxa"/>
+              <w:bottom w:w="70" w:type="dxa"/>
+              <w:end w:w="75" w:type="dxa"/>
             </w:tcMar>
           </w:tcPr>
           <w:p>
             <w:pPr>
-              <w:spacing w:line="240" w:lineRule="auto" w:before="0" w:after="40"/>
-              <w:jc w:val="left"/>
+              <w:spacing w:after="0" w:line="240" w:lineRule="auto"/>
             </w:pPr>
             <w:r/>
             <w:r>
               <w:rPr>
                 <w:rFonts w:ascii="Times New Roman" w:hAnsi="Times New Roman" w:eastAsia="Times New Roman"/>
-                <w:color w:val="000000"/>
-                <w:sz w:val="22"/>
+                <w:b/>
+                <w:sz w:val="18"/>
               </w:rPr>
               <w:t>Zhongyu Yin</w:t>
             </w:r>
@@ -2043,25 +2033,24 @@
             <w:tcW w:w="3765" w:type="dxa"/>
             <w:vAlign w:val="center"/>
             <w:tcMar>
-              <w:top w:w="90" w:type="dxa"/>
-              <w:start w:w="100" w:type="dxa"/>
-              <w:bottom w:w="90" w:type="dxa"/>
-              <w:end w:w="100" w:type="dxa"/>
+              <w:top w:w="70" w:type="dxa"/>
+              <w:start w:w="75" w:type="dxa"/>
+              <w:bottom w:w="70" w:type="dxa"/>
+              <w:end w:w="75" w:type="dxa"/>
             </w:tcMar>
           </w:tcPr>
           <w:p>
             <w:pPr>
-              <w:spacing w:line="240" w:lineRule="auto" w:before="0" w:after="40"/>
-              <w:jc w:val="left"/>
+              <w:spacing w:after="0" w:line="240" w:lineRule="auto"/>
             </w:pPr>
             <w:r/>
             <w:r>
               <w:rPr>
                 <w:rFonts w:ascii="Times New Roman" w:hAnsi="Times New Roman" w:eastAsia="Times New Roman"/>
-                <w:color w:val="B42318"/>
-                <w:sz w:val="19"/>
-              </w:rPr>
-              <w:t>[DRAFT D — confirm] Reproducibility, paired experiment, quantitative results, limitations, and conclusion.</w:t>
+                <w:b w:val="0"/>
+                <w:sz w:val="18"/>
+              </w:rPr>
+              <w:t>[DRAFT — confirm] Environment, paired 30,000-sample evaluation, CA sensitivity, statistics, limitations, and conclusion.</w:t>
             </w:r>
           </w:p>
         </w:tc>
@@ -2125,25 +2114,24 @@
             <w:tcW w:w="3765" w:type="dxa"/>
             <w:vAlign w:val="center"/>
             <w:tcMar>
-              <w:top w:w="90" w:type="dxa"/>
-              <w:start w:w="100" w:type="dxa"/>
-              <w:bottom w:w="90" w:type="dxa"/>
-              <w:end w:w="100" w:type="dxa"/>
+              <w:top w:w="70" w:type="dxa"/>
+              <w:start w:w="75" w:type="dxa"/>
+              <w:bottom w:w="70" w:type="dxa"/>
+              <w:end w:w="75" w:type="dxa"/>
             </w:tcMar>
           </w:tcPr>
           <w:p>
             <w:pPr>
-              <w:spacing w:line="240" w:lineRule="auto" w:before="0" w:after="40"/>
-              <w:jc w:val="left"/>
+              <w:spacing w:after="0" w:line="240" w:lineRule="auto"/>
             </w:pPr>
             <w:r/>
             <w:r>
               <w:rPr>
                 <w:rFonts w:ascii="Times New Roman" w:hAnsi="Times New Roman" w:eastAsia="Times New Roman"/>
-                <w:color w:val="B42318"/>
-                <w:sz w:val="19"/>
-              </w:rPr>
-              <w:t>[DRAFT D — confirm] Training/evaluation protocol, results analysis, figures, conclusion, and final integration.</w:t>
+                <w:b w:val="0"/>
+                <w:sz w:val="18"/>
+              </w:rPr>
+              <w:t>[DRAFT — confirm] Evaluation protocol, results, figures/tables, conclusion, final report/PPT, and repository integration.</w:t>
             </w:r>
           </w:p>
         </w:tc>
@@ -2207,25 +2195,24 @@
             <w:tcW w:w="3765" w:type="dxa"/>
             <w:vAlign w:val="center"/>
             <w:tcMar>
-              <w:top w:w="90" w:type="dxa"/>
-              <w:start w:w="100" w:type="dxa"/>
-              <w:bottom w:w="90" w:type="dxa"/>
-              <w:end w:w="100" w:type="dxa"/>
+              <w:top w:w="70" w:type="dxa"/>
+              <w:start w:w="75" w:type="dxa"/>
+              <w:bottom w:w="70" w:type="dxa"/>
+              <w:end w:w="75" w:type="dxa"/>
             </w:tcMar>
           </w:tcPr>
           <w:p>
             <w:pPr>
-              <w:spacing w:line="240" w:lineRule="auto" w:before="0" w:after="40"/>
-              <w:jc w:val="left"/>
+              <w:spacing w:after="0" w:line="240" w:lineRule="auto"/>
             </w:pPr>
             <w:r/>
             <w:r>
               <w:rPr>
                 <w:rFonts w:ascii="Times New Roman" w:hAnsi="Times New Roman" w:eastAsia="Times New Roman"/>
-                <w:color w:val="B42318"/>
-                <w:sz w:val="19"/>
-              </w:rPr>
-              <w:t>Contribution share: [CONFIRM __%]. Proposed role: Environment, Training, Evaluation, and Final Integration. Implemented and reviewed runtime compatibility, training/checkpoint workflows, fixed-protocol metrics, statistical summaries, and final deliverables.</w:t>
+                <w:b w:val="0"/>
+                <w:sz w:val="17"/>
+              </w:rPr>
+              <w:t>Contribution share: [CONFIRM __%]. Proposed role: Training, Evaluation, and Final Integration. Implemented and audited the paired evaluator, cluster bootstrap, local CL2 ablation, result synthesis, visualizations, final deliverables, and GitHub documentation.</w:t>
             </w:r>
           </w:p>
         </w:tc>
@@ -2275,6 +2262,20 @@
           <w:rFonts w:hint="default" w:ascii="Times New Roman Regular" w:hAnsi="Times New Roman Regular" w:cs="Times New Roman Regular"/>
         </w:rPr>
       </w:pPr>
+    </w:p>
+    <w:p>
+      <w:pPr>
+        <w:jc w:val="center"/>
+      </w:pPr>
+      <w:r>
+        <w:rPr>
+          <w:rFonts w:ascii="Arial" w:hAnsi="Arial" w:eastAsia="Arial"/>
+          <w:b/>
+          <w:color w:val="CC5B0B"/>
+          <w:sz w:val="18"/>
+        </w:rPr>
+        <w:t>DRAFT — confirm group number, group leader, contribution percentages, and role descriptions with all four members before submission.</w:t>
+      </w:r>
     </w:p>
     <w:sectPr>
       <w:pgSz w:w="11900" w:h="16840"/>

</xml_diff>